<commit_message>
Updated Day 3 product brief
</commit_message>
<xml_diff>
--- a/Day3/Idea and Project Thinking.docx
+++ b/Day3/Idea and Project Thinking.docx
@@ -38,12 +38,36 @@
       </w:r>
     </w:p>
     <w:p>
-      <w:pPr>
-        <w:rPr>
-          <w:b/>
-          <w:bCs/>
-        </w:rPr>
-      </w:pPr>
+      <w:r>
+        <w:rPr>
+          <w:b/>
+          <w:bCs/>
+        </w:rPr>
+        <w:t>Solution:</w:t>
+      </w:r>
+      <w:r>
+        <w:t xml:space="preserve"> </w:t>
+      </w:r>
+    </w:p>
+    <w:p>
+      <w:r>
+        <w:t>Develop a centralized Smart Society ERP that allows housing societies to manage resident information, maintenance payments, financial records, complaints, and society notices in one secure web application. The system replaces Excel sheets, WhatsApp chats, and manual registers with a single digital platform, making it easier to organize data, track finances, generate reports, and improve communication between the society committee and residents.</w:t>
+      </w:r>
+    </w:p>
+    <w:p>
+      <w:pPr>
+        <w:rPr>
+          <w:b/>
+          <w:bCs/>
+        </w:rPr>
+      </w:pPr>
+      <w:r>
+        <w:rPr>
+          <w:b/>
+          <w:bCs/>
+        </w:rPr>
+        <w:t xml:space="preserve">3 </w:t>
+      </w:r>
       <w:r>
         <w:rPr>
           <w:b/>
@@ -288,6 +312,7 @@
         </w:numPr>
       </w:pPr>
       <w:r>
+        <w:lastRenderedPageBreak/>
         <w:t>Complaint Management</w:t>
       </w:r>
     </w:p>
@@ -336,7 +361,6 @@
           <w:b/>
           <w:bCs/>
         </w:rPr>
-        <w:lastRenderedPageBreak/>
         <w:t>Out of Scope (MVP)</w:t>
       </w:r>
     </w:p>

</xml_diff>

<commit_message>
Add Day 4 product requirements document
</commit_message>
<xml_diff>
--- a/Day3/Idea and Project Thinking.docx
+++ b/Day3/Idea and Project Thinking.docx
@@ -438,6 +438,20 @@
       <w:r>
         <w:t>Smart Society ERP aims to replace fragmented manual processes with a centralized platform that helps society committee members efficiently manage residents, maintenance, finances, notices, and day-to-day administrative operations.</w:t>
       </w:r>
+    </w:p>
+    <w:p>
+      <w:pPr>
+        <w:rPr>
+          <w:lang w:val="en-US"/>
+        </w:rPr>
+      </w:pPr>
+    </w:p>
+    <w:p>
+      <w:pPr>
+        <w:rPr>
+          <w:lang w:val="en-US"/>
+        </w:rPr>
+      </w:pPr>
     </w:p>
     <w:p>
       <w:pPr>
@@ -1672,6 +1686,7 @@
   <w:style w:type="character" w:default="1" w:styleId="DefaultParagraphFont">
     <w:name w:val="Default Paragraph Font"/>
     <w:uiPriority w:val="1"/>
+    <w:semiHidden/>
     <w:unhideWhenUsed/>
   </w:style>
   <w:style w:type="table" w:default="1" w:styleId="TableNormal">

</xml_diff>